<commit_message>
ACDR2026: minutes - COSEM media team covers ACDR sessions
Co-Authored-By: Claude Opus 5.5 <noreply@anthropic.com>
Claude-Session: https://claude.ai/code/session_011xF77D95cDW5CT1JUxj7vg
</commit_message>
<xml_diff>
--- a/reports/acdr2026_staff_deployment/所内打合せ_議事録_1009.docx
+++ b/reports/acdr2026_staff_deployment/所内打合せ_議事録_1009.docx
@@ -1200,7 +1200,15 @@
         <w:pStyle w:val="ListBullet"/>
       </w:pPr>
       <w:r>
-        <w:t>会場のACDRセッションは、COSEMのメディアチームが撮る見込み。ACDRを撮るか、どこまで撮るかは、Sylviaさんの回答待ち（10月9日に問い合わせ）。公邸の集合写真はADRC職員のみで撮る（公邸資料）。</w:t>
+        <w:t>会場のACDRセッション（Opening、ステージでの集合写真、RT、TS）は、COSEMのメディアチームが撮影する（Sylviaさん 10月9日、了承）。撮影する範囲はSylviaさんが確認して連絡する。ADRCの撮影は記録用の補助。公邸の集合写真はADRC職員のみで撮る（公邸資料）。</w:t>
+      </w:r>
+    </w:p>
+    <w:p>
+      <w:pPr>
+        <w:pStyle w:val="ListBullet"/>
+      </w:pPr>
+      <w:r>
+        <w:t>会場のビデオカメラは会場スクリーン用に業者（ExpoAV）が用意し、操作も業者が行う。Zoomカメラの操作を頼んだときにSylviaさんが付けると言ったCOSEMの補助要員1名を、どう使うかは未定。</w:t>
       </w:r>
     </w:p>
     <w:p>

</xml_diff>